<commit_message>
docs: drop "deliberate" from the Indonesian manuscript
Co-Authored-By: Claude Sonnet 5.5 <noreply@anthropic.com>
</commit_message>
<xml_diff>
--- a/manuscript/manuscript_indonesia.docx
+++ b/manuscript/manuscript_indonesia.docx
@@ -48,7 +48,7 @@
         <w:pStyle w:val="FirstParagraph"/>
       </w:pPr>
       <w:r>
-        <w:t xml:space="preserve">Produk area terbakar biasanya divalidasi di tempat yang kebakarannya besar, bahan bakarnya terdata baik, dan citra acuannya melimpah. Biak, pulau karang terangkat di Papua, Indonesia, tidak memenuhi satu pun syarat itu. Pembakaran di sini berskala kecil, disengaja, dan terjadi pada siang hari; awan menutupi hampir setiap citra optik; dan tidak ada peta bahan bakar lokal ataupun acuan bekas bakar. Kami memetakan area terbakar untuk 23 kejadian pembakaran antara 2023 dan 2026 dengan menerapkan ambang pada NBR+ bitemporal. Ambang itu kami estimasi secara lokal dan kami kendalikan terhadap alarm palsu. Hasilnya kami audit dengan 142 kotak berukuran 60 m yang dilabeli secara manual pada citra Sentinel-2 hasil rekonstruksi 1 m.</w:t>
+        <w:t xml:space="preserve">Produk area terbakar biasanya divalidasi di tempat yang kebakarannya besar, bahan bakarnya terdata baik, dan citra acuannya melimpah. Biak, pulau karang terangkat di Papua, Indonesia, tidak memenuhi satu pun syarat itu. Pembakaran di sini berskala kecil dan terjadi pada siang hari; awan menutupi hampir setiap citra optik; dan tidak ada peta bahan bakar lokal ataupun acuan bekas bakar. Kami memetakan area terbakar untuk 23 kejadian pembakaran antara 2023 dan 2026 dengan menerapkan ambang pada NBR+ bitemporal. Ambang itu kami estimasi secara lokal dan kami kendalikan terhadap alarm palsu. Hasilnya kami audit dengan 142 kotak berukuran 60 m yang dilabeli secara manual pada citra Sentinel-2 hasil rekonstruksi 1 m.</w:t>
       </w:r>
     </w:p>
     <w:p>
@@ -115,7 +115,7 @@
         <w:pStyle w:val="FirstParagraph"/>
       </w:pPr>
       <w:r>
-        <w:t xml:space="preserve">Produk area terbakar global dikalibrasi di tempat yang memungkinkan: hutan boreal dan beriklim sedang, semak belukar Mediterania, dan sabana. Pulau tropis lembap dengan kebakaran kecil, terpecah-pecah, dan sengaja dinyalakan tidak cocok dengan pendekatan itu, dan alasannya saling menumpuk. Api di sini singkat dan jarang bertahan sampai malam, sehingga sensor termal beresolusi kasar hanya melihatnya sekali. Awan meniadakan sebagian besar pengamatan optik. Peta bahan bakar berasal dari produk global yang dilatih dengan data benua. Data acuan tidak ada.</w:t>
+        <w:t xml:space="preserve">Produk area terbakar global dikalibrasi di tempat yang memungkinkan: hutan boreal dan beriklim sedang, semak belukar Mediterania, dan sabana. Pulau tropis lembap dengan kebakaran kecil dan terpecah-pecah tidak cocok dengan pendekatan itu, dan alasannya saling menumpuk. Api di sini singkat dan jarang bertahan sampai malam, sehingga sensor termal beresolusi kasar hanya melihatnya sekali. Awan meniadakan sebagian besar pengamatan optik. Peta bahan bakar berasal dari produk global yang dilatih dengan data benua. Data acuan tidak ada.</w:t>
       </w:r>
     </w:p>
     <w:p>
@@ -193,7 +193,7 @@
         <w:pStyle w:val="BodyText"/>
       </w:pPr>
       <w:r>
-        <w:t xml:space="preserve">Pola pembakarannya terjadi pada siang hari dan berulang. Pada musim penuh pertama yang kami periksa, 651 dari 653 deteksi terjadi pada siang hari dan hanya 2 pada malam hari. Api yang tidak bertahan sampai malam dan muncul kembali di tempat yang sama pada hari-hari berturut-turut adalah ciri pembukaan lahan yang disengaja, bukan kebakaran liar yang tak terkendali. Tiga lokasi berulang memenuhi kriteria persistensi kami. Yang terbesar, di Saramom, mencatat 120 deteksi pada 74 hari yang berbeda antara September 2023 dan Agustus 2026.</w:t>
+        <w:t xml:space="preserve">Pola pembakarannya terjadi pada siang hari dan berulang. Pada musim penuh pertama yang kami periksa, 651 dari 653 deteksi terjadi pada siang hari dan hanya 2 pada malam hari. Api yang tidak bertahan sampai malam dan muncul kembali di tempat yang sama pada hari-hari berturut-turut adalah ciri pembukaan lahan, bukan kebakaran liar yang tak terkendali. Tiga lokasi berulang memenuhi kriteria persistensi kami. Yang terbesar, di Saramom, mencatat 120 deteksi pada 74 hari yang berbeda antara September 2023 dan Agustus 2026.</w:t>
       </w:r>
     </w:p>
     <w:p>

</xml_diff>